<commit_message>
feat(nc): allegati nel report Word NC con immagini embedded e link file
- Le immagini (JPEG/PNG/GIF) vengono scaricate, normalizzate e
  embedded inline nel documento Word come per i report audit
- I file non-immagine compaiono come hyperlink cliccabili
- Riuso delle funzioni audit: embedImagesInZip, xmlHyperlinkPara,
  buildWordInlineImageRun, normalizeImageDataUrlForWordEmbed
- Template NC rigenerato con marker OOXML al posto del loop testuale
- Test aggiornati (758/758 pass)

Co-authored-by: Cursor <cursoragent@cursor.com>
</commit_message>
<xml_diff>
--- a/app/public/templates/NC-scheda.docx
+++ b/app/public/templates/NC-scheda.docx
@@ -733,7 +733,7 @@
           <w:szCs w:val="24"/>
           <w:rFonts w:ascii="Arial" w:cs="Arial" w:eastAsia="Arial" w:hAnsi="Arial"/>
         </w:rPr>
-        <w:t xml:space="preserve">3. Analisi delle cause</w:t>
+        <w:t xml:space="preserve">3. Analisi delle cause e valutazione</w:t>
       </w:r>
     </w:p>
     <w:p>
@@ -750,6 +750,38 @@
           <w:rFonts w:ascii="Arial" w:cs="Arial" w:eastAsia="Arial" w:hAnsi="Arial"/>
         </w:rPr>
         <w:t xml:space="preserve">{rootCause}</w:t>
+      </w:r>
+    </w:p>
+    <w:p>
+      <w:pPr>
+        <w:spacing w:before="0" w:after="60"/>
+        <w:jc w:val="left"/>
+      </w:pPr>
+      <w:r>
+        <w:rPr>
+          <w:b w:val="false"/>
+          <w:bCs w:val="false"/>
+          <w:sz w:val="20"/>
+          <w:szCs w:val="20"/>
+          <w:rFonts w:ascii="Arial" w:cs="Arial" w:eastAsia="Arial" w:hAnsi="Arial"/>
+        </w:rPr>
+        <w:t xml:space="preserve">Necessità azione correttiva: {correctiveActionNeeded}</w:t>
+      </w:r>
+    </w:p>
+    <w:p>
+      <w:pPr>
+        <w:spacing w:before="0" w:after="120"/>
+        <w:jc w:val="left"/>
+      </w:pPr>
+      <w:r>
+        <w:rPr>
+          <w:b w:val="false"/>
+          <w:bCs w:val="false"/>
+          <w:sz w:val="20"/>
+          <w:szCs w:val="20"/>
+          <w:rFonts w:ascii="Arial" w:cs="Arial" w:eastAsia="Arial" w:hAnsi="Arial"/>
+        </w:rPr>
+        <w:t xml:space="preserve">Motivazione: {correctiveActionEvalNotes}</w:t>
       </w:r>
     </w:p>
     <w:p>
@@ -766,7 +798,7 @@
           <w:szCs w:val="24"/>
           <w:rFonts w:ascii="Arial" w:cs="Arial" w:eastAsia="Arial" w:hAnsi="Arial"/>
         </w:rPr>
-        <w:t xml:space="preserve">4. Azioni correttive</w:t>
+        <w:t xml:space="preserve">4. Correzione (ISO 10.2.1a)</w:t>
       </w:r>
     </w:p>
     <w:p>
@@ -782,7 +814,7 @@
           <w:szCs w:val="22"/>
           <w:rFonts w:ascii="Arial" w:cs="Arial" w:eastAsia="Arial" w:hAnsi="Arial"/>
         </w:rPr>
-        <w:t xml:space="preserve">{#noActions}Nessuna azione registrata.{/noActions}</w:t>
+        <w:t xml:space="preserve">{#noCorrections}Nessuna correzione registrata.{/noCorrections}</w:t>
       </w:r>
     </w:p>
     <w:p>
@@ -798,7 +830,7 @@
           <w:szCs w:val="22"/>
           <w:rFonts w:ascii="Arial" w:cs="Arial" w:eastAsia="Arial" w:hAnsi="Arial"/>
         </w:rPr>
-        <w:t xml:space="preserve">{#actions}</w:t>
+        <w:t xml:space="preserve">{#corrections}</w:t>
       </w:r>
     </w:p>
     <w:p>
@@ -814,7 +846,7 @@
           <w:szCs w:val="20"/>
           <w:rFonts w:ascii="Arial" w:cs="Arial" w:eastAsia="Arial" w:hAnsi="Arial"/>
         </w:rPr>
-        <w:t xml:space="preserve">{actionIndex}. {typeLabel} - {statusLabel}</w:t>
+        <w:t xml:space="preserve">{actionIndex}. Immediata - {statusLabel}</w:t>
       </w:r>
     </w:p>
     <w:p>
@@ -910,7 +942,7 @@
           <w:szCs w:val="22"/>
           <w:rFonts w:ascii="Arial" w:cs="Arial" w:eastAsia="Arial" w:hAnsi="Arial"/>
         </w:rPr>
-        <w:t xml:space="preserve">{/actions}</w:t>
+        <w:t xml:space="preserve">{/corrections}</w:t>
       </w:r>
     </w:p>
     <w:p>
@@ -927,12 +959,12 @@
           <w:szCs w:val="24"/>
           <w:rFonts w:ascii="Arial" w:cs="Arial" w:eastAsia="Arial" w:hAnsi="Arial"/>
         </w:rPr>
-        <w:t xml:space="preserve">5. Verifica efficacia</w:t>
-      </w:r>
-    </w:p>
-    <w:p>
-      <w:pPr>
-        <w:spacing w:before="0" w:after="240"/>
+        <w:t xml:space="preserve">5. Azioni correttive / preventive</w:t>
+      </w:r>
+    </w:p>
+    <w:p>
+      <w:pPr>
+        <w:spacing w:before="0" w:after="120"/>
         <w:jc w:val="left"/>
       </w:pPr>
       <w:r>
@@ -943,12 +975,12 @@
           <w:szCs w:val="22"/>
           <w:rFonts w:ascii="Arial" w:cs="Arial" w:eastAsia="Arial" w:hAnsi="Arial"/>
         </w:rPr>
-        <w:t xml:space="preserve">{verificationNotes}</w:t>
-      </w:r>
-    </w:p>
-    <w:p>
-      <w:pPr>
-        <w:spacing w:before="0" w:after="120"/>
+        <w:t xml:space="preserve">{#noActions}Nessuna azione correttiva/preventiva registrata.{/noActions}</w:t>
+      </w:r>
+    </w:p>
+    <w:p>
+      <w:pPr>
+        <w:spacing w:before="0" w:after="40"/>
         <w:jc w:val="left"/>
       </w:pPr>
       <w:r>
@@ -959,7 +991,119 @@
           <w:szCs w:val="22"/>
           <w:rFonts w:ascii="Arial" w:cs="Arial" w:eastAsia="Arial" w:hAnsi="Arial"/>
         </w:rPr>
-        <w:t xml:space="preserve">Responsabile verifica: {verificationResponsible}</w:t>
+        <w:t xml:space="preserve">{#actions}</w:t>
+      </w:r>
+    </w:p>
+    <w:p>
+      <w:pPr>
+        <w:spacing w:before="0" w:after="60"/>
+        <w:jc w:val="left"/>
+      </w:pPr>
+      <w:r>
+        <w:rPr>
+          <w:b/>
+          <w:bCs/>
+          <w:sz w:val="20"/>
+          <w:szCs w:val="20"/>
+          <w:rFonts w:ascii="Arial" w:cs="Arial" w:eastAsia="Arial" w:hAnsi="Arial"/>
+        </w:rPr>
+        <w:t xml:space="preserve">{actionIndex}. {typeLabel} - {statusLabel}</w:t>
+      </w:r>
+    </w:p>
+    <w:p>
+      <w:pPr>
+        <w:spacing w:before="0" w:after="40"/>
+        <w:jc w:val="left"/>
+      </w:pPr>
+      <w:r>
+        <w:rPr>
+          <w:b w:val="false"/>
+          <w:bCs w:val="false"/>
+          <w:sz w:val="20"/>
+          <w:szCs w:val="20"/>
+          <w:rFonts w:ascii="Arial" w:cs="Arial" w:eastAsia="Arial" w:hAnsi="Arial"/>
+        </w:rPr>
+        <w:t xml:space="preserve">Responsabile: {responsible}</w:t>
+      </w:r>
+    </w:p>
+    <w:p>
+      <w:pPr>
+        <w:spacing w:before="0" w:after="40"/>
+        <w:jc w:val="left"/>
+      </w:pPr>
+      <w:r>
+        <w:rPr>
+          <w:b w:val="false"/>
+          <w:bCs w:val="false"/>
+          <w:sz w:val="20"/>
+          <w:szCs w:val="20"/>
+          <w:rFonts w:ascii="Arial" w:cs="Arial" w:eastAsia="Arial" w:hAnsi="Arial"/>
+        </w:rPr>
+        <w:t xml:space="preserve">Scadenza: {dueDate}</w:t>
+      </w:r>
+    </w:p>
+    <w:p>
+      <w:pPr>
+        <w:spacing w:before="0" w:after="40"/>
+        <w:jc w:val="left"/>
+      </w:pPr>
+      <w:r>
+        <w:rPr>
+          <w:b w:val="false"/>
+          <w:bCs w:val="false"/>
+          <w:sz w:val="20"/>
+          <w:szCs w:val="20"/>
+          <w:rFonts w:ascii="Arial" w:cs="Arial" w:eastAsia="Arial" w:hAnsi="Arial"/>
+        </w:rPr>
+        <w:t xml:space="preserve">Completata il: {completedAt}</w:t>
+      </w:r>
+    </w:p>
+    <w:p>
+      <w:pPr>
+        <w:spacing w:before="0" w:after="80"/>
+        <w:jc w:val="left"/>
+      </w:pPr>
+      <w:r>
+        <w:rPr>
+          <w:b w:val="false"/>
+          <w:bCs w:val="false"/>
+          <w:sz w:val="20"/>
+          <w:szCs w:val="20"/>
+          <w:rFonts w:ascii="Arial" w:cs="Arial" w:eastAsia="Arial" w:hAnsi="Arial"/>
+        </w:rPr>
+        <w:t xml:space="preserve">{description}</w:t>
+      </w:r>
+    </w:p>
+    <w:p>
+      <w:pPr>
+        <w:spacing w:before="0" w:after="160"/>
+        <w:jc w:val="left"/>
+      </w:pPr>
+      <w:r>
+        <w:rPr>
+          <w:b w:val="false"/>
+          <w:bCs w:val="false"/>
+          <w:sz w:val="20"/>
+          <w:szCs w:val="20"/>
+          <w:rFonts w:ascii="Arial" w:cs="Arial" w:eastAsia="Arial" w:hAnsi="Arial"/>
+        </w:rPr>
+        <w:t xml:space="preserve">Verifica: {verificationNote}</w:t>
+      </w:r>
+    </w:p>
+    <w:p>
+      <w:pPr>
+        <w:spacing w:before="0" w:after="160"/>
+        <w:jc w:val="left"/>
+      </w:pPr>
+      <w:r>
+        <w:rPr>
+          <w:b w:val="false"/>
+          <w:bCs w:val="false"/>
+          <w:sz w:val="22"/>
+          <w:szCs w:val="22"/>
+          <w:rFonts w:ascii="Arial" w:cs="Arial" w:eastAsia="Arial" w:hAnsi="Arial"/>
+        </w:rPr>
+        <w:t xml:space="preserve">{/actions}</w:t>
       </w:r>
     </w:p>
     <w:p>
@@ -976,12 +1120,12 @@
           <w:szCs w:val="24"/>
           <w:rFonts w:ascii="Arial" w:cs="Arial" w:eastAsia="Arial" w:hAnsi="Arial"/>
         </w:rPr>
-        <w:t xml:space="preserve">6. Chiusura e approvazione</w:t>
-      </w:r>
-    </w:p>
-    <w:p>
-      <w:pPr>
-        <w:spacing w:before="0" w:after="60"/>
+        <w:t xml:space="preserve">6. Verifica efficacia</w:t>
+      </w:r>
+    </w:p>
+    <w:p>
+      <w:pPr>
+        <w:spacing w:before="0" w:after="240"/>
         <w:jc w:val="left"/>
       </w:pPr>
       <w:r>
@@ -992,7 +1136,7 @@
           <w:szCs w:val="22"/>
           <w:rFonts w:ascii="Arial" w:cs="Arial" w:eastAsia="Arial" w:hAnsi="Arial"/>
         </w:rPr>
-        <w:t xml:space="preserve">Approvata da: {approvedByName}</w:t>
+        <w:t xml:space="preserve">{verificationNotes}</w:t>
       </w:r>
     </w:p>
     <w:p>
@@ -1008,7 +1152,7 @@
           <w:szCs w:val="22"/>
           <w:rFonts w:ascii="Arial" w:cs="Arial" w:eastAsia="Arial" w:hAnsi="Arial"/>
         </w:rPr>
-        <w:t xml:space="preserve">Approvata il: {approvedAt}</w:t>
+        <w:t xml:space="preserve">Responsabile verifica: {verificationResponsible}</w:t>
       </w:r>
     </w:p>
     <w:p>
@@ -1025,12 +1169,12 @@
           <w:szCs w:val="24"/>
           <w:rFonts w:ascii="Arial" w:cs="Arial" w:eastAsia="Arial" w:hAnsi="Arial"/>
         </w:rPr>
-        <w:t xml:space="preserve">7. Evidenze allegate</w:t>
-      </w:r>
-    </w:p>
-    <w:p>
-      <w:pPr>
-        <w:spacing w:before="0" w:after="120"/>
+        <w:t xml:space="preserve">7. Chiusura e approvazione</w:t>
+      </w:r>
+    </w:p>
+    <w:p>
+      <w:pPr>
+        <w:spacing w:before="0" w:after="60"/>
         <w:jc w:val="left"/>
       </w:pPr>
       <w:r>
@@ -1041,12 +1185,12 @@
           <w:szCs w:val="22"/>
           <w:rFonts w:ascii="Arial" w:cs="Arial" w:eastAsia="Arial" w:hAnsi="Arial"/>
         </w:rPr>
-        <w:t xml:space="preserve">Totale allegati: {attachmentsCount}</w:t>
-      </w:r>
-    </w:p>
-    <w:p>
-      <w:pPr>
-        <w:spacing w:before="0" w:after="40"/>
+        <w:t xml:space="preserve">Approvata da: {approvedByName}</w:t>
+      </w:r>
+    </w:p>
+    <w:p>
+      <w:pPr>
+        <w:spacing w:before="0" w:after="120"/>
         <w:jc w:val="left"/>
       </w:pPr>
       <w:r>
@@ -1057,60 +1201,29 @@
           <w:szCs w:val="22"/>
           <w:rFonts w:ascii="Arial" w:cs="Arial" w:eastAsia="Arial" w:hAnsi="Arial"/>
         </w:rPr>
-        <w:t xml:space="preserve">{#attachments}</w:t>
-      </w:r>
-    </w:p>
-    <w:p>
-      <w:pPr>
-        <w:spacing w:before="0" w:after="40"/>
-        <w:jc w:val="left"/>
-      </w:pPr>
-      <w:r>
-        <w:rPr>
-          <w:b w:val="false"/>
-          <w:bCs w:val="false"/>
-          <w:sz w:val="20"/>
-          <w:szCs w:val="20"/>
-          <w:rFonts w:ascii="Arial" w:cs="Arial" w:eastAsia="Arial" w:hAnsi="Arial"/>
-        </w:rPr>
-        <w:t xml:space="preserve">- {fileName} ({category})</w:t>
-      </w:r>
-    </w:p>
-    <w:p>
-      <w:pPr>
-        <w:spacing w:before="0" w:after="40"/>
-        <w:jc w:val="left"/>
-      </w:pPr>
-      <w:r>
-        <w:rPr>
-          <w:b w:val="false"/>
-          <w:bCs w:val="false"/>
-          <w:sz w:val="20"/>
-          <w:szCs w:val="20"/>
-          <w:rFonts w:ascii="Arial" w:cs="Arial" w:eastAsia="Arial" w:hAnsi="Arial"/>
-        </w:rPr>
-        <w:t xml:space="preserve">{fileDescription}</w:t>
+        <w:t xml:space="preserve">Approvata il: {approvedAt}</w:t>
+      </w:r>
+    </w:p>
+    <w:p>
+      <w:pPr>
+        <w:spacing w:before="280" w:after="120"/>
+        <w:jc w:val="left"/>
+      </w:pPr>
+      <w:r>
+        <w:rPr>
+          <w:b/>
+          <w:bCs/>
+          <w:color w:val="34495E"/>
+          <w:sz w:val="24"/>
+          <w:szCs w:val="24"/>
+          <w:rFonts w:ascii="Arial" w:cs="Arial" w:eastAsia="Arial" w:hAnsi="Arial"/>
+        </w:rPr>
+        <w:t xml:space="preserve">8. Evidenze allegate</w:t>
       </w:r>
     </w:p>
     <w:p>
       <w:pPr>
         <w:spacing w:before="0" w:after="120"/>
-        <w:jc w:val="left"/>
-      </w:pPr>
-      <w:r>
-        <w:rPr>
-          <w:b w:val="false"/>
-          <w:bCs w:val="false"/>
-          <w:sz w:val="20"/>
-          <w:szCs w:val="20"/>
-          <w:rFonts w:ascii="Arial" w:cs="Arial" w:eastAsia="Arial" w:hAnsi="Arial"/>
-        </w:rPr>
-        <w:t xml:space="preserve">Caricato il: {uploadedAt}</w:t>
-      </w:r>
-    </w:p>
-    <w:p>
-      <w:pPr>
-        <w:spacing w:before="0" w:after="160"/>
         <w:jc w:val="left"/>
       </w:pPr>
       <w:r>
@@ -1121,7 +1234,23 @@
           <w:szCs w:val="22"/>
           <w:rFonts w:ascii="Arial" w:cs="Arial" w:eastAsia="Arial" w:hAnsi="Arial"/>
         </w:rPr>
-        <w:t xml:space="preserve">{/attachments}</w:t>
+        <w:t xml:space="preserve">Totale allegati: {attachmentsCount}</w:t>
+      </w:r>
+    </w:p>
+    <w:p>
+      <w:pPr>
+        <w:spacing w:before="0" w:after="160"/>
+        <w:jc w:val="left"/>
+      </w:pPr>
+      <w:r>
+        <w:rPr>
+          <w:b w:val="false"/>
+          <w:bCs w:val="false"/>
+          <w:sz w:val="22"/>
+          <w:szCs w:val="22"/>
+          <w:rFonts w:ascii="Arial" w:cs="Arial" w:eastAsia="Arial" w:hAnsi="Arial"/>
+        </w:rPr>
+        <w:t xml:space="preserve">NC_ATTACHMENTS_MARKER</w:t>
       </w:r>
     </w:p>
     <w:p>

</xml_diff>

<commit_message>
fix(nc): correzione e allegati nel report Word NC
- Rinomina placeholder azione in actionDescription (evita conflitto con description NC)
- Rigenera template NC-scheda.docx con placeholder corretti
- Corregge replaceNcAttachmentsMarker: la regex cancellava tutto il documento
- Precarica immagini allegati via fetchAttachmentBlob autenticato
- Token allegati URL-encoded; supporto image/webp
- Test integrazione docxtemplater + template reale

Co-authored-by: QS Studio <marcocamellini@qsstudio241.onmicrosoft.com>
</commit_message>
<xml_diff>
--- a/app/public/templates/NC-scheda.docx
+++ b/app/public/templates/NC-scheda.docx
@@ -910,7 +910,7 @@
           <w:szCs w:val="20"/>
           <w:rFonts w:ascii="Arial" w:cs="Arial" w:eastAsia="Arial" w:hAnsi="Arial"/>
         </w:rPr>
-        <w:t xml:space="preserve">{description}</w:t>
+        <w:t xml:space="preserve">{actionDescription}</w:t>
       </w:r>
     </w:p>
     <w:p>
@@ -1071,7 +1071,7 @@
           <w:szCs w:val="20"/>
           <w:rFonts w:ascii="Arial" w:cs="Arial" w:eastAsia="Arial" w:hAnsi="Arial"/>
         </w:rPr>
-        <w:t xml:space="preserve">{description}</w:t>
+        <w:t xml:space="preserve">{actionDescription}</w:t>
       </w:r>
     </w:p>
     <w:p>

</xml_diff>